<commit_message>
Corrección del repositorio para el TP evaluable 7 y Creación de Linea Base 3
</commit_message>
<xml_diff>
--- a/material_propio/trabajos_practicos/tp7/rg8_tp7_scrum.docx
+++ b/material_propio/trabajos_practicos/tp7/rg8_tp7_scrum.docx
@@ -336,7 +336,21 @@
           <w:color w:val="000000"/>
           <w:sz w:val="26"/>
         </w:rPr>
-        <w:t>Barbera, Salvador (Ayudante 1ra)</w:t>
+        <w:t xml:space="preserve">Barbera, Salvador (Ayudante </w:t>
+      </w:r>
+      <w:r>
+        <w:rPr>
+          <w:color w:val="000000"/>
+          <w:sz w:val="26"/>
+        </w:rPr>
+        <w:t>2d</w:t>
+      </w:r>
+      <w:r>
+        <w:rPr>
+          <w:color w:val="000000"/>
+          <w:sz w:val="26"/>
+        </w:rPr>
+        <w:t>a)</w:t>
       </w:r>
       <w:r>
         <w:rPr>
@@ -2230,13 +2244,31 @@
               <w:ind w:right="28"/>
               <w:rPr>
                 <w:color w:val="000000"/>
-              </w:rPr>
-            </w:pPr>
-            <w:r>
-              <w:rPr>
-                <w:color w:val="000000"/>
-              </w:rPr>
-              <w:t xml:space="preserve">● Ejecución de Sprint </w:t>
+                <w:lang w:val="en-US"/>
+              </w:rPr>
+            </w:pPr>
+            <w:r>
+              <w:rPr>
+                <w:color w:val="000000"/>
+                <w:lang w:val="en-US"/>
+              </w:rPr>
+              <w:t xml:space="preserve">● </w:t>
+            </w:r>
+            <w:proofErr w:type="spellStart"/>
+            <w:r>
+              <w:rPr>
+                <w:color w:val="000000"/>
+                <w:lang w:val="en-US"/>
+              </w:rPr>
+              <w:t>Ejecución</w:t>
+            </w:r>
+            <w:proofErr w:type="spellEnd"/>
+            <w:r>
+              <w:rPr>
+                <w:color w:val="000000"/>
+                <w:lang w:val="en-US"/>
+              </w:rPr>
+              <w:t xml:space="preserve"> de Sprint </w:t>
             </w:r>
           </w:p>
           <w:p>
@@ -2260,15 +2292,41 @@
               <w:ind w:right="28"/>
               <w:rPr>
                 <w:color w:val="000000"/>
-                <w:lang w:val="en-US"/>
-              </w:rPr>
-            </w:pPr>
-            <w:r>
-              <w:rPr>
-                <w:color w:val="000000"/>
-                <w:lang w:val="en-US"/>
-              </w:rPr>
-              <w:t xml:space="preserve">● Sprint Review Meeting </w:t>
+              </w:rPr>
+            </w:pPr>
+            <w:r>
+              <w:rPr>
+                <w:color w:val="000000"/>
+              </w:rPr>
+              <w:t xml:space="preserve">● Sprint </w:t>
+            </w:r>
+            <w:proofErr w:type="spellStart"/>
+            <w:r>
+              <w:rPr>
+                <w:color w:val="000000"/>
+              </w:rPr>
+              <w:t>Review</w:t>
+            </w:r>
+            <w:proofErr w:type="spellEnd"/>
+            <w:r>
+              <w:rPr>
+                <w:color w:val="000000"/>
+              </w:rPr>
+              <w:t xml:space="preserve"> </w:t>
+            </w:r>
+            <w:proofErr w:type="gramStart"/>
+            <w:r>
+              <w:rPr>
+                <w:color w:val="000000"/>
+              </w:rPr>
+              <w:t>Meeting</w:t>
+            </w:r>
+            <w:proofErr w:type="gramEnd"/>
+            <w:r>
+              <w:rPr>
+                <w:color w:val="000000"/>
+              </w:rPr>
+              <w:t xml:space="preserve"> </w:t>
             </w:r>
           </w:p>
           <w:p>
@@ -2340,7 +2398,7 @@
           <w:noProof/>
         </w:rPr>
         <w:drawing>
-          <wp:inline distT="0" distB="0" distL="0" distR="0" wp14:anchorId="0B8861C5" wp14:editId="715E9432">
+          <wp:inline distT="0" distB="0" distL="0" distR="0" wp14:anchorId="0B8861C5" wp14:editId="0CBC19CD">
             <wp:extent cx="5400040" cy="3037840"/>
             <wp:effectExtent l="0" t="0" r="0" b="0"/>
             <wp:docPr id="456417329" name="Picture 1"/>
@@ -2386,7 +2444,7 @@
           <w:noProof/>
         </w:rPr>
         <w:drawing>
-          <wp:inline distT="0" distB="0" distL="0" distR="0" wp14:anchorId="58CB5CDA" wp14:editId="2173C523">
+          <wp:inline distT="0" distB="0" distL="0" distR="0" wp14:anchorId="58CB5CDA" wp14:editId="7E6F3E75">
             <wp:extent cx="5400040" cy="3037840"/>
             <wp:effectExtent l="0" t="0" r="0" b="0"/>
             <wp:docPr id="1668089941" name="Picture 2"/>
@@ -2433,7 +2491,7 @@
         </w:rPr>
         <w:lastRenderedPageBreak/>
         <w:drawing>
-          <wp:inline distT="0" distB="0" distL="0" distR="0" wp14:anchorId="02C7289E" wp14:editId="3E962770">
+          <wp:inline distT="0" distB="0" distL="0" distR="0" wp14:anchorId="02C7289E" wp14:editId="57E16F14">
             <wp:extent cx="5400040" cy="3037840"/>
             <wp:effectExtent l="0" t="0" r="0" b="0"/>
             <wp:docPr id="337553040" name="Picture 3"/>
@@ -2479,7 +2537,7 @@
           <w:noProof/>
         </w:rPr>
         <w:drawing>
-          <wp:inline distT="0" distB="0" distL="0" distR="0" wp14:anchorId="4EB05012" wp14:editId="6F5F859F">
+          <wp:inline distT="0" distB="0" distL="0" distR="0" wp14:anchorId="4EB05012" wp14:editId="4DE4A6D7">
             <wp:extent cx="5400040" cy="3037840"/>
             <wp:effectExtent l="0" t="0" r="0" b="0"/>
             <wp:docPr id="661973803" name="Picture 4"/>
@@ -2587,7 +2645,13 @@
         </w:numPr>
       </w:pPr>
       <w:r>
-        <w:t>Gráfico de Velocidad:</w:t>
+        <w:t>Gráfico de Velocidad</w:t>
+      </w:r>
+      <w:r>
+        <w:t>/Capacidad</w:t>
+      </w:r>
+      <w:r>
+        <w:t>:</w:t>
       </w:r>
     </w:p>
     <w:p>
@@ -2640,29 +2704,155 @@
           <w:noProof/>
         </w:rPr>
         <w:drawing>
-          <wp:inline distT="0" distB="0" distL="0" distR="0" wp14:anchorId="31BAF0AD" wp14:editId="493E8F4E">
-            <wp:extent cx="5000625" cy="2971800"/>
-            <wp:effectExtent l="0" t="0" r="9525" b="0"/>
-            <wp:docPr id="552357925" name="Gráfico 1">
-              <a:extLst xmlns:a="http://schemas.openxmlformats.org/drawingml/2006/main">
-                <a:ext uri="{FF2B5EF4-FFF2-40B4-BE49-F238E27FC236}">
-                  <a16:creationId xmlns:a16="http://schemas.microsoft.com/office/drawing/2014/main" id="{6CA94267-7A73-C494-F485-57DBCC82ACCF}"/>
-                </a:ext>
-              </a:extLst>
-            </wp:docPr>
-            <wp:cNvGraphicFramePr/>
+          <wp:inline distT="0" distB="0" distL="0" distR="0" wp14:anchorId="5FCF91FF" wp14:editId="3920C3C5">
+            <wp:extent cx="5334000" cy="3000375"/>
+            <wp:effectExtent l="0" t="0" r="0" b="9525"/>
+            <wp:docPr id="1" name="s1" descr="Gráfico de burnout del sprint 1" title="Burnout sprint 1"/>
+            <wp:cNvGraphicFramePr>
+              <a:graphicFrameLocks xmlns:a="http://schemas.openxmlformats.org/drawingml/2006/main" noChangeAspect="1"/>
+            </wp:cNvGraphicFramePr>
             <a:graphic xmlns:a="http://schemas.openxmlformats.org/drawingml/2006/main">
-              <a:graphicData uri="http://schemas.openxmlformats.org/drawingml/2006/chart">
-                <c:chart xmlns:c="http://schemas.openxmlformats.org/drawingml/2006/chart" xmlns:r="http://schemas.openxmlformats.org/officeDocument/2006/relationships" r:id="rId14"/>
+              <a:graphicData uri="http://schemas.openxmlformats.org/drawingml/2006/picture">
+                <pic:pic xmlns:pic="http://schemas.openxmlformats.org/drawingml/2006/picture">
+                  <pic:nvPicPr>
+                    <pic:cNvPr id="1" name="s1" descr="Gráfico de burnout del sprint 1" title="Burnout sprint 1"/>
+                    <pic:cNvPicPr>
+                      <a:picLocks noChangeAspect="1"/>
+                    </pic:cNvPicPr>
+                  </pic:nvPicPr>
+                  <pic:blipFill>
+                    <a:blip r:embed="rId14"/>
+                    <a:srcRect/>
+                    <a:stretch>
+                      <a:fillRect/>
+                    </a:stretch>
+                  </pic:blipFill>
+                  <pic:spPr bwMode="auto">
+                    <a:xfrm>
+                      <a:off x="0" y="0"/>
+                      <a:ext cx="5334000" cy="3000375"/>
+                    </a:xfrm>
+                    <a:prstGeom prst="rect">
+                      <a:avLst/>
+                    </a:prstGeom>
+                  </pic:spPr>
+                </pic:pic>
               </a:graphicData>
             </a:graphic>
           </wp:inline>
         </w:drawing>
       </w:r>
     </w:p>
+    <w:p>
+      <w:pPr>
+        <w:jc w:val="center"/>
+      </w:pPr>
+      <w:r>
+        <w:rPr>
+          <w:noProof/>
+        </w:rPr>
+        <w:lastRenderedPageBreak/>
+        <w:drawing>
+          <wp:inline distT="0" distB="0" distL="0" distR="0" wp14:anchorId="13763700" wp14:editId="3928C33B">
+            <wp:extent cx="5334000" cy="3000375"/>
+            <wp:effectExtent l="0" t="0" r="0" b="9525"/>
+            <wp:docPr id="1422002696" name="s2" descr="Gráfico de burnout del sprint 2" title="Burnout sprint 2"/>
+            <wp:cNvGraphicFramePr>
+              <a:graphicFrameLocks xmlns:a="http://schemas.openxmlformats.org/drawingml/2006/main" noChangeAspect="1"/>
+            </wp:cNvGraphicFramePr>
+            <a:graphic xmlns:a="http://schemas.openxmlformats.org/drawingml/2006/main">
+              <a:graphicData uri="http://schemas.openxmlformats.org/drawingml/2006/picture">
+                <pic:pic xmlns:pic="http://schemas.openxmlformats.org/drawingml/2006/picture">
+                  <pic:nvPicPr>
+                    <pic:cNvPr id="1422002696" name="s2" descr="Gráfico de burnout del sprint 2" title="Burnout sprint 2"/>
+                    <pic:cNvPicPr>
+                      <a:picLocks noChangeAspect="1"/>
+                    </pic:cNvPicPr>
+                  </pic:nvPicPr>
+                  <pic:blipFill>
+                    <a:blip r:embed="rId15"/>
+                    <a:srcRect/>
+                    <a:stretch>
+                      <a:fillRect/>
+                    </a:stretch>
+                  </pic:blipFill>
+                  <pic:spPr bwMode="auto">
+                    <a:xfrm>
+                      <a:off x="0" y="0"/>
+                      <a:ext cx="5334000" cy="3000375"/>
+                    </a:xfrm>
+                    <a:prstGeom prst="rect">
+                      <a:avLst/>
+                    </a:prstGeom>
+                  </pic:spPr>
+                </pic:pic>
+              </a:graphicData>
+            </a:graphic>
+          </wp:inline>
+        </w:drawing>
+      </w:r>
+    </w:p>
+    <w:p>
+      <w:pPr>
+        <w:jc w:val="center"/>
+      </w:pPr>
+      <w:r>
+        <w:rPr>
+          <w:noProof/>
+        </w:rPr>
+        <w:drawing>
+          <wp:inline distT="0" distB="0" distL="0" distR="0" wp14:anchorId="3972D1B3" wp14:editId="04E39B12">
+            <wp:extent cx="5334000" cy="3000375"/>
+            <wp:effectExtent l="0" t="0" r="0" b="9525"/>
+            <wp:docPr id="280990684" name="s3" descr="Gráfico de burnout del sprint 3" title="Burnout sprint 3"/>
+            <wp:cNvGraphicFramePr>
+              <a:graphicFrameLocks xmlns:a="http://schemas.openxmlformats.org/drawingml/2006/main" noChangeAspect="1"/>
+            </wp:cNvGraphicFramePr>
+            <a:graphic xmlns:a="http://schemas.openxmlformats.org/drawingml/2006/main">
+              <a:graphicData uri="http://schemas.openxmlformats.org/drawingml/2006/picture">
+                <pic:pic xmlns:pic="http://schemas.openxmlformats.org/drawingml/2006/picture">
+                  <pic:nvPicPr>
+                    <pic:cNvPr id="280990684" name="s3" descr="Gráfico de burnout del sprint 3" title="Burnout sprint 3"/>
+                    <pic:cNvPicPr>
+                      <a:picLocks noChangeAspect="1"/>
+                    </pic:cNvPicPr>
+                  </pic:nvPicPr>
+                  <pic:blipFill>
+                    <a:blip r:embed="rId16"/>
+                    <a:srcRect/>
+                    <a:stretch>
+                      <a:fillRect/>
+                    </a:stretch>
+                  </pic:blipFill>
+                  <pic:spPr bwMode="auto">
+                    <a:xfrm>
+                      <a:off x="0" y="0"/>
+                      <a:ext cx="5334000" cy="3000375"/>
+                    </a:xfrm>
+                    <a:prstGeom prst="rect">
+                      <a:avLst/>
+                    </a:prstGeom>
+                  </pic:spPr>
+                </pic:pic>
+              </a:graphicData>
+            </a:graphic>
+          </wp:inline>
+        </w:drawing>
+      </w:r>
+    </w:p>
+    <w:p>
+      <w:pPr>
+        <w:jc w:val="center"/>
+      </w:pPr>
+    </w:p>
+    <w:p>
+      <w:pPr>
+        <w:jc w:val="center"/>
+      </w:pPr>
+    </w:p>
     <w:sectPr>
-      <w:headerReference w:type="default" r:id="rId15"/>
-      <w:footerReference w:type="default" r:id="rId16"/>
+      <w:headerReference w:type="default" r:id="rId17"/>
+      <w:footerReference w:type="default" r:id="rId18"/>
       <w:pgSz w:w="11906" w:h="16838"/>
       <w:pgMar w:top="1417" w:right="1701" w:bottom="1417" w:left="1701" w:header="708" w:footer="708" w:gutter="0"/>
       <w:cols w:space="708"/>
@@ -5189,566 +5379,7 @@
 </c:chartSpace>
 </file>
 
-<file path=word/charts/chart2.xml><?xml version="1.0" encoding="utf-8"?>
-<c:chartSpace xmlns:c="http://schemas.openxmlformats.org/drawingml/2006/chart" xmlns:a="http://schemas.openxmlformats.org/drawingml/2006/main" xmlns:r="http://schemas.openxmlformats.org/officeDocument/2006/relationships" xmlns:c16r2="http://schemas.microsoft.com/office/drawing/2015/06/chart">
-  <c:date1904 val="0"/>
-  <c:lang val="en-US"/>
-  <c:roundedCorners val="0"/>
-  <mc:AlternateContent xmlns:mc="http://schemas.openxmlformats.org/markup-compatibility/2006">
-    <mc:Choice xmlns:c14="http://schemas.microsoft.com/office/drawing/2007/8/2/chart" Requires="c14">
-      <c14:style val="102"/>
-    </mc:Choice>
-    <mc:Fallback>
-      <c:style val="2"/>
-    </mc:Fallback>
-  </mc:AlternateContent>
-  <c:chart>
-    <c:title>
-      <c:tx>
-        <c:rich>
-          <a:bodyPr rot="0" spcFirstLastPara="1" vertOverflow="ellipsis" vert="horz" wrap="square" anchor="ctr" anchorCtr="1"/>
-          <a:lstStyle/>
-          <a:p>
-            <a:pPr>
-              <a:defRPr sz="1400" b="0" i="0" u="none" strike="noStrike" kern="1200" spc="0" baseline="0">
-                <a:solidFill>
-                  <a:schemeClr val="tx1">
-                    <a:lumMod val="65000"/>
-                    <a:lumOff val="35000"/>
-                  </a:schemeClr>
-                </a:solidFill>
-                <a:latin typeface="+mn-lt"/>
-                <a:ea typeface="+mn-ea"/>
-                <a:cs typeface="+mn-cs"/>
-              </a:defRPr>
-            </a:pPr>
-            <a:r>
-              <a:rPr lang="es-AR"/>
-              <a:t>Gráfico de burnout</a:t>
-            </a:r>
-          </a:p>
-        </c:rich>
-      </c:tx>
-      <c:overlay val="0"/>
-      <c:spPr>
-        <a:noFill/>
-        <a:ln>
-          <a:noFill/>
-        </a:ln>
-        <a:effectLst/>
-      </c:spPr>
-      <c:txPr>
-        <a:bodyPr rot="0" spcFirstLastPara="1" vertOverflow="ellipsis" vert="horz" wrap="square" anchor="ctr" anchorCtr="1"/>
-        <a:lstStyle/>
-        <a:p>
-          <a:pPr>
-            <a:defRPr sz="1400" b="0" i="0" u="none" strike="noStrike" kern="1200" spc="0" baseline="0">
-              <a:solidFill>
-                <a:schemeClr val="tx1">
-                  <a:lumMod val="65000"/>
-                  <a:lumOff val="35000"/>
-                </a:schemeClr>
-              </a:solidFill>
-              <a:latin typeface="+mn-lt"/>
-              <a:ea typeface="+mn-ea"/>
-              <a:cs typeface="+mn-cs"/>
-            </a:defRPr>
-          </a:pPr>
-          <a:endParaRPr lang="es-AR"/>
-        </a:p>
-      </c:txPr>
-    </c:title>
-    <c:autoTitleDeleted val="0"/>
-    <c:plotArea>
-      <c:layout/>
-      <c:lineChart>
-        <c:grouping val="standard"/>
-        <c:varyColors val="0"/>
-        <c:ser>
-          <c:idx val="0"/>
-          <c:order val="0"/>
-          <c:spPr>
-            <a:ln w="28575" cap="rnd">
-              <a:solidFill>
-                <a:schemeClr val="accent1"/>
-              </a:solidFill>
-              <a:round/>
-            </a:ln>
-            <a:effectLst/>
-          </c:spPr>
-          <c:marker>
-            <c:symbol val="circle"/>
-            <c:size val="5"/>
-            <c:spPr>
-              <a:solidFill>
-                <a:schemeClr val="accent1"/>
-              </a:solidFill>
-              <a:ln w="9525">
-                <a:solidFill>
-                  <a:schemeClr val="accent1"/>
-                </a:solidFill>
-              </a:ln>
-              <a:effectLst/>
-            </c:spPr>
-          </c:marker>
-          <c:dLbls>
-            <c:spPr>
-              <a:noFill/>
-              <a:ln>
-                <a:noFill/>
-              </a:ln>
-              <a:effectLst/>
-            </c:spPr>
-            <c:txPr>
-              <a:bodyPr rot="0" spcFirstLastPara="1" vertOverflow="ellipsis" vert="horz" wrap="square" lIns="38100" tIns="19050" rIns="38100" bIns="19050" anchor="ctr" anchorCtr="1">
-                <a:spAutoFit/>
-              </a:bodyPr>
-              <a:lstStyle/>
-              <a:p>
-                <a:pPr>
-                  <a:defRPr sz="900" b="0" i="0" u="none" strike="noStrike" kern="1200" baseline="0">
-                    <a:solidFill>
-                      <a:schemeClr val="tx1">
-                        <a:lumMod val="75000"/>
-                        <a:lumOff val="25000"/>
-                      </a:schemeClr>
-                    </a:solidFill>
-                    <a:latin typeface="+mn-lt"/>
-                    <a:ea typeface="+mn-ea"/>
-                    <a:cs typeface="+mn-cs"/>
-                  </a:defRPr>
-                </a:pPr>
-                <a:endParaRPr lang="es-AR"/>
-              </a:p>
-            </c:txPr>
-            <c:dLblPos val="t"/>
-            <c:showLegendKey val="0"/>
-            <c:showVal val="1"/>
-            <c:showCatName val="0"/>
-            <c:showSerName val="0"/>
-            <c:showPercent val="0"/>
-            <c:showBubbleSize val="0"/>
-            <c:showLeaderLines val="0"/>
-            <c:extLst>
-              <c:ext xmlns:c15="http://schemas.microsoft.com/office/drawing/2012/chart" uri="{CE6537A1-D6FC-4f65-9D91-7224C49458BB}">
-                <c15:showLeaderLines val="1"/>
-                <c15:leaderLines>
-                  <c:spPr>
-                    <a:ln w="9525" cap="flat" cmpd="sng" algn="ctr">
-                      <a:solidFill>
-                        <a:schemeClr val="tx1">
-                          <a:lumMod val="35000"/>
-                          <a:lumOff val="65000"/>
-                        </a:schemeClr>
-                      </a:solidFill>
-                      <a:round/>
-                    </a:ln>
-                    <a:effectLst/>
-                  </c:spPr>
-                </c15:leaderLines>
-              </c:ext>
-            </c:extLst>
-          </c:dLbls>
-          <c:cat>
-            <c:strRef>
-              <c:f>Hoja1!$A$19:$A$27</c:f>
-              <c:strCache>
-                <c:ptCount val="9"/>
-                <c:pt idx="0">
-                  <c:v>s1</c:v>
-                </c:pt>
-                <c:pt idx="1">
-                  <c:v>s2</c:v>
-                </c:pt>
-                <c:pt idx="2">
-                  <c:v>s3 /fin sprint 1</c:v>
-                </c:pt>
-                <c:pt idx="3">
-                  <c:v>s1</c:v>
-                </c:pt>
-                <c:pt idx="4">
-                  <c:v>s2</c:v>
-                </c:pt>
-                <c:pt idx="5">
-                  <c:v>s3/fin sprint 2</c:v>
-                </c:pt>
-                <c:pt idx="6">
-                  <c:v>s1</c:v>
-                </c:pt>
-                <c:pt idx="7">
-                  <c:v>s2</c:v>
-                </c:pt>
-                <c:pt idx="8">
-                  <c:v>s3/fin sprint 3</c:v>
-                </c:pt>
-              </c:strCache>
-            </c:strRef>
-          </c:cat>
-          <c:val>
-            <c:numRef>
-              <c:f>Hoja1!$B$19:$B$27</c:f>
-              <c:numCache>
-                <c:formatCode>General</c:formatCode>
-                <c:ptCount val="9"/>
-                <c:pt idx="0">
-                  <c:v>20</c:v>
-                </c:pt>
-                <c:pt idx="1">
-                  <c:v>20</c:v>
-                </c:pt>
-                <c:pt idx="2">
-                  <c:v>20</c:v>
-                </c:pt>
-                <c:pt idx="3">
-                  <c:v>17</c:v>
-                </c:pt>
-                <c:pt idx="4">
-                  <c:v>12</c:v>
-                </c:pt>
-                <c:pt idx="5">
-                  <c:v>9</c:v>
-                </c:pt>
-                <c:pt idx="6">
-                  <c:v>8</c:v>
-                </c:pt>
-                <c:pt idx="7">
-                  <c:v>3</c:v>
-                </c:pt>
-                <c:pt idx="8">
-                  <c:v>0</c:v>
-                </c:pt>
-              </c:numCache>
-            </c:numRef>
-          </c:val>
-          <c:smooth val="0"/>
-          <c:extLst>
-            <c:ext xmlns:c16="http://schemas.microsoft.com/office/drawing/2014/chart" uri="{C3380CC4-5D6E-409C-BE32-E72D297353CC}">
-              <c16:uniqueId val="{00000000-3637-4C02-BB90-D60141300185}"/>
-            </c:ext>
-          </c:extLst>
-        </c:ser>
-        <c:dLbls>
-          <c:dLblPos val="t"/>
-          <c:showLegendKey val="0"/>
-          <c:showVal val="1"/>
-          <c:showCatName val="0"/>
-          <c:showSerName val="0"/>
-          <c:showPercent val="0"/>
-          <c:showBubbleSize val="0"/>
-        </c:dLbls>
-        <c:marker val="1"/>
-        <c:smooth val="0"/>
-        <c:axId val="1899990304"/>
-        <c:axId val="615644912"/>
-      </c:lineChart>
-      <c:catAx>
-        <c:axId val="1899990304"/>
-        <c:scaling>
-          <c:orientation val="minMax"/>
-        </c:scaling>
-        <c:delete val="0"/>
-        <c:axPos val="b"/>
-        <c:title>
-          <c:tx>
-            <c:rich>
-              <a:bodyPr rot="0" spcFirstLastPara="1" vertOverflow="ellipsis" vert="horz" wrap="square" anchor="ctr" anchorCtr="1"/>
-              <a:lstStyle/>
-              <a:p>
-                <a:pPr>
-                  <a:defRPr sz="1000" b="0" i="0" u="none" strike="noStrike" kern="1200" baseline="0">
-                    <a:solidFill>
-                      <a:schemeClr val="tx1">
-                        <a:lumMod val="65000"/>
-                        <a:lumOff val="35000"/>
-                      </a:schemeClr>
-                    </a:solidFill>
-                    <a:latin typeface="+mn-lt"/>
-                    <a:ea typeface="+mn-ea"/>
-                    <a:cs typeface="+mn-cs"/>
-                  </a:defRPr>
-                </a:pPr>
-                <a:r>
-                  <a:rPr lang="es-AR"/>
-                  <a:t>Semanas</a:t>
-                </a:r>
-              </a:p>
-            </c:rich>
-          </c:tx>
-          <c:overlay val="0"/>
-          <c:spPr>
-            <a:noFill/>
-            <a:ln>
-              <a:noFill/>
-            </a:ln>
-            <a:effectLst/>
-          </c:spPr>
-          <c:txPr>
-            <a:bodyPr rot="0" spcFirstLastPara="1" vertOverflow="ellipsis" vert="horz" wrap="square" anchor="ctr" anchorCtr="1"/>
-            <a:lstStyle/>
-            <a:p>
-              <a:pPr>
-                <a:defRPr sz="1000" b="0" i="0" u="none" strike="noStrike" kern="1200" baseline="0">
-                  <a:solidFill>
-                    <a:schemeClr val="tx1">
-                      <a:lumMod val="65000"/>
-                      <a:lumOff val="35000"/>
-                    </a:schemeClr>
-                  </a:solidFill>
-                  <a:latin typeface="+mn-lt"/>
-                  <a:ea typeface="+mn-ea"/>
-                  <a:cs typeface="+mn-cs"/>
-                </a:defRPr>
-              </a:pPr>
-              <a:endParaRPr lang="es-AR"/>
-            </a:p>
-          </c:txPr>
-        </c:title>
-        <c:numFmt formatCode="General" sourceLinked="1"/>
-        <c:majorTickMark val="none"/>
-        <c:minorTickMark val="none"/>
-        <c:tickLblPos val="nextTo"/>
-        <c:spPr>
-          <a:noFill/>
-          <a:ln w="9525" cap="flat" cmpd="sng" algn="ctr">
-            <a:solidFill>
-              <a:schemeClr val="tx1">
-                <a:lumMod val="15000"/>
-                <a:lumOff val="85000"/>
-              </a:schemeClr>
-            </a:solidFill>
-            <a:round/>
-          </a:ln>
-          <a:effectLst/>
-        </c:spPr>
-        <c:txPr>
-          <a:bodyPr rot="-60000000" spcFirstLastPara="1" vertOverflow="ellipsis" vert="horz" wrap="square" anchor="ctr" anchorCtr="1"/>
-          <a:lstStyle/>
-          <a:p>
-            <a:pPr>
-              <a:defRPr sz="900" b="0" i="0" u="none" strike="noStrike" kern="1200" baseline="0">
-                <a:solidFill>
-                  <a:schemeClr val="tx1">
-                    <a:lumMod val="65000"/>
-                    <a:lumOff val="35000"/>
-                  </a:schemeClr>
-                </a:solidFill>
-                <a:latin typeface="+mn-lt"/>
-                <a:ea typeface="+mn-ea"/>
-                <a:cs typeface="+mn-cs"/>
-              </a:defRPr>
-            </a:pPr>
-            <a:endParaRPr lang="es-AR"/>
-          </a:p>
-        </c:txPr>
-        <c:crossAx val="615644912"/>
-        <c:crosses val="autoZero"/>
-        <c:auto val="1"/>
-        <c:lblAlgn val="ctr"/>
-        <c:lblOffset val="100"/>
-        <c:noMultiLvlLbl val="0"/>
-      </c:catAx>
-      <c:valAx>
-        <c:axId val="615644912"/>
-        <c:scaling>
-          <c:orientation val="minMax"/>
-        </c:scaling>
-        <c:delete val="0"/>
-        <c:axPos val="l"/>
-        <c:majorGridlines>
-          <c:spPr>
-            <a:ln w="9525" cap="flat" cmpd="sng" algn="ctr">
-              <a:solidFill>
-                <a:schemeClr val="tx1">
-                  <a:lumMod val="15000"/>
-                  <a:lumOff val="85000"/>
-                </a:schemeClr>
-              </a:solidFill>
-              <a:round/>
-            </a:ln>
-            <a:effectLst/>
-          </c:spPr>
-        </c:majorGridlines>
-        <c:title>
-          <c:tx>
-            <c:rich>
-              <a:bodyPr rot="-5400000" spcFirstLastPara="1" vertOverflow="ellipsis" vert="horz" wrap="square" anchor="ctr" anchorCtr="1"/>
-              <a:lstStyle/>
-              <a:p>
-                <a:pPr>
-                  <a:defRPr sz="1000" b="0" i="0" u="none" strike="noStrike" kern="1200" baseline="0">
-                    <a:solidFill>
-                      <a:schemeClr val="tx1">
-                        <a:lumMod val="65000"/>
-                        <a:lumOff val="35000"/>
-                      </a:schemeClr>
-                    </a:solidFill>
-                    <a:latin typeface="+mn-lt"/>
-                    <a:ea typeface="+mn-ea"/>
-                    <a:cs typeface="+mn-cs"/>
-                  </a:defRPr>
-                </a:pPr>
-                <a:r>
-                  <a:rPr lang="es-AR"/>
-                  <a:t>story points</a:t>
-                </a:r>
-              </a:p>
-            </c:rich>
-          </c:tx>
-          <c:overlay val="0"/>
-          <c:spPr>
-            <a:noFill/>
-            <a:ln>
-              <a:noFill/>
-            </a:ln>
-            <a:effectLst/>
-          </c:spPr>
-          <c:txPr>
-            <a:bodyPr rot="-5400000" spcFirstLastPara="1" vertOverflow="ellipsis" vert="horz" wrap="square" anchor="ctr" anchorCtr="1"/>
-            <a:lstStyle/>
-            <a:p>
-              <a:pPr>
-                <a:defRPr sz="1000" b="0" i="0" u="none" strike="noStrike" kern="1200" baseline="0">
-                  <a:solidFill>
-                    <a:schemeClr val="tx1">
-                      <a:lumMod val="65000"/>
-                      <a:lumOff val="35000"/>
-                    </a:schemeClr>
-                  </a:solidFill>
-                  <a:latin typeface="+mn-lt"/>
-                  <a:ea typeface="+mn-ea"/>
-                  <a:cs typeface="+mn-cs"/>
-                </a:defRPr>
-              </a:pPr>
-              <a:endParaRPr lang="es-AR"/>
-            </a:p>
-          </c:txPr>
-        </c:title>
-        <c:numFmt formatCode="General" sourceLinked="1"/>
-        <c:majorTickMark val="none"/>
-        <c:minorTickMark val="none"/>
-        <c:tickLblPos val="nextTo"/>
-        <c:spPr>
-          <a:noFill/>
-          <a:ln>
-            <a:noFill/>
-          </a:ln>
-          <a:effectLst/>
-        </c:spPr>
-        <c:txPr>
-          <a:bodyPr rot="-60000000" spcFirstLastPara="1" vertOverflow="ellipsis" vert="horz" wrap="square" anchor="ctr" anchorCtr="1"/>
-          <a:lstStyle/>
-          <a:p>
-            <a:pPr>
-              <a:defRPr sz="900" b="0" i="0" u="none" strike="noStrike" kern="1200" baseline="0">
-                <a:solidFill>
-                  <a:schemeClr val="tx1">
-                    <a:lumMod val="65000"/>
-                    <a:lumOff val="35000"/>
-                  </a:schemeClr>
-                </a:solidFill>
-                <a:latin typeface="+mn-lt"/>
-                <a:ea typeface="+mn-ea"/>
-                <a:cs typeface="+mn-cs"/>
-              </a:defRPr>
-            </a:pPr>
-            <a:endParaRPr lang="es-AR"/>
-          </a:p>
-        </c:txPr>
-        <c:crossAx val="1899990304"/>
-        <c:crosses val="autoZero"/>
-        <c:crossBetween val="between"/>
-      </c:valAx>
-      <c:spPr>
-        <a:noFill/>
-        <a:ln>
-          <a:noFill/>
-        </a:ln>
-        <a:effectLst/>
-      </c:spPr>
-    </c:plotArea>
-    <c:plotVisOnly val="1"/>
-    <c:dispBlanksAs val="gap"/>
-    <c:showDLblsOverMax val="0"/>
-    <c:extLst>
-      <c:ext xmlns:c16r3="http://schemas.microsoft.com/office/drawing/2017/03/chart" uri="{56B9EC1D-385E-4148-901F-78D8002777C0}">
-        <c16r3:dataDisplayOptions16>
-          <c16r3:dispNaAsBlank val="1"/>
-        </c16r3:dataDisplayOptions16>
-      </c:ext>
-    </c:extLst>
-  </c:chart>
-  <c:spPr>
-    <a:solidFill>
-      <a:schemeClr val="bg1"/>
-    </a:solidFill>
-    <a:ln w="9525" cap="flat" cmpd="sng" algn="ctr">
-      <a:solidFill>
-        <a:schemeClr val="tx1">
-          <a:lumMod val="15000"/>
-          <a:lumOff val="85000"/>
-        </a:schemeClr>
-      </a:solidFill>
-      <a:round/>
-    </a:ln>
-    <a:effectLst/>
-  </c:spPr>
-  <c:txPr>
-    <a:bodyPr/>
-    <a:lstStyle/>
-    <a:p>
-      <a:pPr>
-        <a:defRPr/>
-      </a:pPr>
-      <a:endParaRPr lang="es-AR"/>
-    </a:p>
-  </c:txPr>
-  <c:externalData r:id="rId3">
-    <c:autoUpdate val="0"/>
-  </c:externalData>
-</c:chartSpace>
-</file>
-
 <file path=word/charts/colors1.xml><?xml version="1.0" encoding="utf-8"?>
-<cs:colorStyle xmlns:cs="http://schemas.microsoft.com/office/drawing/2012/chartStyle" xmlns:a="http://schemas.openxmlformats.org/drawingml/2006/main" meth="cycle" id="10">
-  <a:schemeClr val="accent1"/>
-  <a:schemeClr val="accent2"/>
-  <a:schemeClr val="accent3"/>
-  <a:schemeClr val="accent4"/>
-  <a:schemeClr val="accent5"/>
-  <a:schemeClr val="accent6"/>
-  <cs:variation/>
-  <cs:variation>
-    <a:lumMod val="60000"/>
-  </cs:variation>
-  <cs:variation>
-    <a:lumMod val="80000"/>
-    <a:lumOff val="20000"/>
-  </cs:variation>
-  <cs:variation>
-    <a:lumMod val="80000"/>
-  </cs:variation>
-  <cs:variation>
-    <a:lumMod val="60000"/>
-    <a:lumOff val="40000"/>
-  </cs:variation>
-  <cs:variation>
-    <a:lumMod val="50000"/>
-  </cs:variation>
-  <cs:variation>
-    <a:lumMod val="70000"/>
-    <a:lumOff val="30000"/>
-  </cs:variation>
-  <cs:variation>
-    <a:lumMod val="70000"/>
-  </cs:variation>
-  <cs:variation>
-    <a:lumMod val="50000"/>
-    <a:lumOff val="50000"/>
-  </cs:variation>
-</cs:colorStyle>
-</file>
-
-<file path=word/charts/colors2.xml><?xml version="1.0" encoding="utf-8"?>
 <cs:colorStyle xmlns:cs="http://schemas.microsoft.com/office/drawing/2012/chartStyle" xmlns:a="http://schemas.openxmlformats.org/drawingml/2006/main" meth="cycle" id="10">
   <a:schemeClr val="accent1"/>
   <a:schemeClr val="accent2"/>
@@ -5790,509 +5421,6 @@
 
 <file path=word/charts/style1.xml><?xml version="1.0" encoding="utf-8"?>
 <cs:chartStyle xmlns:cs="http://schemas.microsoft.com/office/drawing/2012/chartStyle" xmlns:a="http://schemas.openxmlformats.org/drawingml/2006/main" id="201">
-  <cs:axisTitle>
-    <cs:lnRef idx="0"/>
-    <cs:fillRef idx="0"/>
-    <cs:effectRef idx="0"/>
-    <cs:fontRef idx="minor">
-      <a:schemeClr val="tx1">
-        <a:lumMod val="65000"/>
-        <a:lumOff val="35000"/>
-      </a:schemeClr>
-    </cs:fontRef>
-    <cs:defRPr sz="1000" kern="1200"/>
-  </cs:axisTitle>
-  <cs:categoryAxis>
-    <cs:lnRef idx="0"/>
-    <cs:fillRef idx="0"/>
-    <cs:effectRef idx="0"/>
-    <cs:fontRef idx="minor">
-      <a:schemeClr val="tx1">
-        <a:lumMod val="65000"/>
-        <a:lumOff val="35000"/>
-      </a:schemeClr>
-    </cs:fontRef>
-    <cs:spPr>
-      <a:ln w="9525" cap="flat" cmpd="sng" algn="ctr">
-        <a:solidFill>
-          <a:schemeClr val="tx1">
-            <a:lumMod val="15000"/>
-            <a:lumOff val="85000"/>
-          </a:schemeClr>
-        </a:solidFill>
-        <a:round/>
-      </a:ln>
-    </cs:spPr>
-    <cs:defRPr sz="900" kern="1200"/>
-  </cs:categoryAxis>
-  <cs:chartArea mods="allowNoFillOverride allowNoLineOverride">
-    <cs:lnRef idx="0"/>
-    <cs:fillRef idx="0"/>
-    <cs:effectRef idx="0"/>
-    <cs:fontRef idx="minor">
-      <a:schemeClr val="tx1"/>
-    </cs:fontRef>
-    <cs:spPr>
-      <a:solidFill>
-        <a:schemeClr val="bg1"/>
-      </a:solidFill>
-      <a:ln w="9525" cap="flat" cmpd="sng" algn="ctr">
-        <a:solidFill>
-          <a:schemeClr val="tx1">
-            <a:lumMod val="15000"/>
-            <a:lumOff val="85000"/>
-          </a:schemeClr>
-        </a:solidFill>
-        <a:round/>
-      </a:ln>
-    </cs:spPr>
-    <cs:defRPr sz="1000" kern="1200"/>
-  </cs:chartArea>
-  <cs:dataLabel>
-    <cs:lnRef idx="0"/>
-    <cs:fillRef idx="0"/>
-    <cs:effectRef idx="0"/>
-    <cs:fontRef idx="minor">
-      <a:schemeClr val="tx1">
-        <a:lumMod val="75000"/>
-        <a:lumOff val="25000"/>
-      </a:schemeClr>
-    </cs:fontRef>
-    <cs:defRPr sz="900" kern="1200"/>
-  </cs:dataLabel>
-  <cs:dataLabelCallout>
-    <cs:lnRef idx="0"/>
-    <cs:fillRef idx="0"/>
-    <cs:effectRef idx="0"/>
-    <cs:fontRef idx="minor">
-      <a:schemeClr val="dk1">
-        <a:lumMod val="65000"/>
-        <a:lumOff val="35000"/>
-      </a:schemeClr>
-    </cs:fontRef>
-    <cs:spPr>
-      <a:solidFill>
-        <a:schemeClr val="lt1"/>
-      </a:solidFill>
-      <a:ln>
-        <a:solidFill>
-          <a:schemeClr val="dk1">
-            <a:lumMod val="25000"/>
-            <a:lumOff val="75000"/>
-          </a:schemeClr>
-        </a:solidFill>
-      </a:ln>
-    </cs:spPr>
-    <cs:defRPr sz="900" kern="1200"/>
-    <cs:bodyPr rot="0" spcFirstLastPara="1" vertOverflow="clip" horzOverflow="clip" vert="horz" wrap="square" lIns="36576" tIns="18288" rIns="36576" bIns="18288" anchor="ctr" anchorCtr="1">
-      <a:spAutoFit/>
-    </cs:bodyPr>
-  </cs:dataLabelCallout>
-  <cs:dataPoint>
-    <cs:lnRef idx="0"/>
-    <cs:fillRef idx="1">
-      <cs:styleClr val="auto"/>
-    </cs:fillRef>
-    <cs:effectRef idx="0"/>
-    <cs:fontRef idx="minor">
-      <a:schemeClr val="tx1"/>
-    </cs:fontRef>
-  </cs:dataPoint>
-  <cs:dataPoint3D>
-    <cs:lnRef idx="0"/>
-    <cs:fillRef idx="1">
-      <cs:styleClr val="auto"/>
-    </cs:fillRef>
-    <cs:effectRef idx="0"/>
-    <cs:fontRef idx="minor">
-      <a:schemeClr val="tx1"/>
-    </cs:fontRef>
-  </cs:dataPoint3D>
-  <cs:dataPointLine>
-    <cs:lnRef idx="0">
-      <cs:styleClr val="auto"/>
-    </cs:lnRef>
-    <cs:fillRef idx="1"/>
-    <cs:effectRef idx="0"/>
-    <cs:fontRef idx="minor">
-      <a:schemeClr val="tx1"/>
-    </cs:fontRef>
-    <cs:spPr>
-      <a:ln w="28575" cap="rnd">
-        <a:solidFill>
-          <a:schemeClr val="phClr"/>
-        </a:solidFill>
-        <a:round/>
-      </a:ln>
-    </cs:spPr>
-  </cs:dataPointLine>
-  <cs:dataPointMarker>
-    <cs:lnRef idx="0">
-      <cs:styleClr val="auto"/>
-    </cs:lnRef>
-    <cs:fillRef idx="1">
-      <cs:styleClr val="auto"/>
-    </cs:fillRef>
-    <cs:effectRef idx="0"/>
-    <cs:fontRef idx="minor">
-      <a:schemeClr val="tx1"/>
-    </cs:fontRef>
-    <cs:spPr>
-      <a:ln w="9525">
-        <a:solidFill>
-          <a:schemeClr val="phClr"/>
-        </a:solidFill>
-      </a:ln>
-    </cs:spPr>
-  </cs:dataPointMarker>
-  <cs:dataPointMarkerLayout symbol="circle" size="5"/>
-  <cs:dataPointWireframe>
-    <cs:lnRef idx="0">
-      <cs:styleClr val="auto"/>
-    </cs:lnRef>
-    <cs:fillRef idx="1"/>
-    <cs:effectRef idx="0"/>
-    <cs:fontRef idx="minor">
-      <a:schemeClr val="tx1"/>
-    </cs:fontRef>
-    <cs:spPr>
-      <a:ln w="9525" cap="rnd">
-        <a:solidFill>
-          <a:schemeClr val="phClr"/>
-        </a:solidFill>
-        <a:round/>
-      </a:ln>
-    </cs:spPr>
-  </cs:dataPointWireframe>
-  <cs:dataTable>
-    <cs:lnRef idx="0"/>
-    <cs:fillRef idx="0"/>
-    <cs:effectRef idx="0"/>
-    <cs:fontRef idx="minor">
-      <a:schemeClr val="tx1">
-        <a:lumMod val="65000"/>
-        <a:lumOff val="35000"/>
-      </a:schemeClr>
-    </cs:fontRef>
-    <cs:spPr>
-      <a:noFill/>
-      <a:ln w="9525" cap="flat" cmpd="sng" algn="ctr">
-        <a:solidFill>
-          <a:schemeClr val="tx1">
-            <a:lumMod val="15000"/>
-            <a:lumOff val="85000"/>
-          </a:schemeClr>
-        </a:solidFill>
-        <a:round/>
-      </a:ln>
-    </cs:spPr>
-    <cs:defRPr sz="900" kern="1200"/>
-  </cs:dataTable>
-  <cs:downBar>
-    <cs:lnRef idx="0"/>
-    <cs:fillRef idx="0"/>
-    <cs:effectRef idx="0"/>
-    <cs:fontRef idx="minor">
-      <a:schemeClr val="dk1"/>
-    </cs:fontRef>
-    <cs:spPr>
-      <a:solidFill>
-        <a:schemeClr val="dk1">
-          <a:lumMod val="65000"/>
-          <a:lumOff val="35000"/>
-        </a:schemeClr>
-      </a:solidFill>
-      <a:ln w="9525">
-        <a:solidFill>
-          <a:schemeClr val="tx1">
-            <a:lumMod val="65000"/>
-            <a:lumOff val="35000"/>
-          </a:schemeClr>
-        </a:solidFill>
-      </a:ln>
-    </cs:spPr>
-  </cs:downBar>
-  <cs:dropLine>
-    <cs:lnRef idx="0"/>
-    <cs:fillRef idx="0"/>
-    <cs:effectRef idx="0"/>
-    <cs:fontRef idx="minor">
-      <a:schemeClr val="tx1"/>
-    </cs:fontRef>
-    <cs:spPr>
-      <a:ln w="9525" cap="flat" cmpd="sng" algn="ctr">
-        <a:solidFill>
-          <a:schemeClr val="tx1">
-            <a:lumMod val="35000"/>
-            <a:lumOff val="65000"/>
-          </a:schemeClr>
-        </a:solidFill>
-        <a:round/>
-      </a:ln>
-    </cs:spPr>
-  </cs:dropLine>
-  <cs:errorBar>
-    <cs:lnRef idx="0"/>
-    <cs:fillRef idx="0"/>
-    <cs:effectRef idx="0"/>
-    <cs:fontRef idx="minor">
-      <a:schemeClr val="tx1"/>
-    </cs:fontRef>
-    <cs:spPr>
-      <a:ln w="9525" cap="flat" cmpd="sng" algn="ctr">
-        <a:solidFill>
-          <a:schemeClr val="tx1">
-            <a:lumMod val="65000"/>
-            <a:lumOff val="35000"/>
-          </a:schemeClr>
-        </a:solidFill>
-        <a:round/>
-      </a:ln>
-    </cs:spPr>
-  </cs:errorBar>
-  <cs:floor>
-    <cs:lnRef idx="0"/>
-    <cs:fillRef idx="0"/>
-    <cs:effectRef idx="0"/>
-    <cs:fontRef idx="minor">
-      <a:schemeClr val="tx1"/>
-    </cs:fontRef>
-    <cs:spPr>
-      <a:noFill/>
-      <a:ln>
-        <a:noFill/>
-      </a:ln>
-    </cs:spPr>
-  </cs:floor>
-  <cs:gridlineMajor>
-    <cs:lnRef idx="0"/>
-    <cs:fillRef idx="0"/>
-    <cs:effectRef idx="0"/>
-    <cs:fontRef idx="minor">
-      <a:schemeClr val="tx1"/>
-    </cs:fontRef>
-    <cs:spPr>
-      <a:ln w="9525" cap="flat" cmpd="sng" algn="ctr">
-        <a:solidFill>
-          <a:schemeClr val="tx1">
-            <a:lumMod val="15000"/>
-            <a:lumOff val="85000"/>
-          </a:schemeClr>
-        </a:solidFill>
-        <a:round/>
-      </a:ln>
-    </cs:spPr>
-  </cs:gridlineMajor>
-  <cs:gridlineMinor>
-    <cs:lnRef idx="0"/>
-    <cs:fillRef idx="0"/>
-    <cs:effectRef idx="0"/>
-    <cs:fontRef idx="minor">
-      <a:schemeClr val="tx1"/>
-    </cs:fontRef>
-    <cs:spPr>
-      <a:ln w="9525" cap="flat" cmpd="sng" algn="ctr">
-        <a:solidFill>
-          <a:schemeClr val="tx1">
-            <a:lumMod val="5000"/>
-            <a:lumOff val="95000"/>
-          </a:schemeClr>
-        </a:solidFill>
-        <a:round/>
-      </a:ln>
-    </cs:spPr>
-  </cs:gridlineMinor>
-  <cs:hiLoLine>
-    <cs:lnRef idx="0"/>
-    <cs:fillRef idx="0"/>
-    <cs:effectRef idx="0"/>
-    <cs:fontRef idx="minor">
-      <a:schemeClr val="tx1"/>
-    </cs:fontRef>
-    <cs:spPr>
-      <a:ln w="9525" cap="flat" cmpd="sng" algn="ctr">
-        <a:solidFill>
-          <a:schemeClr val="tx1">
-            <a:lumMod val="75000"/>
-            <a:lumOff val="25000"/>
-          </a:schemeClr>
-        </a:solidFill>
-        <a:round/>
-      </a:ln>
-    </cs:spPr>
-  </cs:hiLoLine>
-  <cs:leaderLine>
-    <cs:lnRef idx="0"/>
-    <cs:fillRef idx="0"/>
-    <cs:effectRef idx="0"/>
-    <cs:fontRef idx="minor">
-      <a:schemeClr val="tx1"/>
-    </cs:fontRef>
-    <cs:spPr>
-      <a:ln w="9525" cap="flat" cmpd="sng" algn="ctr">
-        <a:solidFill>
-          <a:schemeClr val="tx1">
-            <a:lumMod val="35000"/>
-            <a:lumOff val="65000"/>
-          </a:schemeClr>
-        </a:solidFill>
-        <a:round/>
-      </a:ln>
-    </cs:spPr>
-  </cs:leaderLine>
-  <cs:legend>
-    <cs:lnRef idx="0"/>
-    <cs:fillRef idx="0"/>
-    <cs:effectRef idx="0"/>
-    <cs:fontRef idx="minor">
-      <a:schemeClr val="tx1">
-        <a:lumMod val="65000"/>
-        <a:lumOff val="35000"/>
-      </a:schemeClr>
-    </cs:fontRef>
-    <cs:defRPr sz="900" kern="1200"/>
-  </cs:legend>
-  <cs:plotArea mods="allowNoFillOverride allowNoLineOverride">
-    <cs:lnRef idx="0"/>
-    <cs:fillRef idx="0"/>
-    <cs:effectRef idx="0"/>
-    <cs:fontRef idx="minor">
-      <a:schemeClr val="tx1"/>
-    </cs:fontRef>
-  </cs:plotArea>
-  <cs:plotArea3D mods="allowNoFillOverride allowNoLineOverride">
-    <cs:lnRef idx="0"/>
-    <cs:fillRef idx="0"/>
-    <cs:effectRef idx="0"/>
-    <cs:fontRef idx="minor">
-      <a:schemeClr val="tx1"/>
-    </cs:fontRef>
-  </cs:plotArea3D>
-  <cs:seriesAxis>
-    <cs:lnRef idx="0"/>
-    <cs:fillRef idx="0"/>
-    <cs:effectRef idx="0"/>
-    <cs:fontRef idx="minor">
-      <a:schemeClr val="tx1">
-        <a:lumMod val="65000"/>
-        <a:lumOff val="35000"/>
-      </a:schemeClr>
-    </cs:fontRef>
-    <cs:defRPr sz="900" kern="1200"/>
-  </cs:seriesAxis>
-  <cs:seriesLine>
-    <cs:lnRef idx="0"/>
-    <cs:fillRef idx="0"/>
-    <cs:effectRef idx="0"/>
-    <cs:fontRef idx="minor">
-      <a:schemeClr val="tx1"/>
-    </cs:fontRef>
-    <cs:spPr>
-      <a:ln w="9525" cap="flat" cmpd="sng" algn="ctr">
-        <a:solidFill>
-          <a:schemeClr val="tx1">
-            <a:lumMod val="35000"/>
-            <a:lumOff val="65000"/>
-          </a:schemeClr>
-        </a:solidFill>
-        <a:round/>
-      </a:ln>
-    </cs:spPr>
-  </cs:seriesLine>
-  <cs:title>
-    <cs:lnRef idx="0"/>
-    <cs:fillRef idx="0"/>
-    <cs:effectRef idx="0"/>
-    <cs:fontRef idx="minor">
-      <a:schemeClr val="tx1">
-        <a:lumMod val="65000"/>
-        <a:lumOff val="35000"/>
-      </a:schemeClr>
-    </cs:fontRef>
-    <cs:defRPr sz="1400" b="0" kern="1200" spc="0" baseline="0"/>
-  </cs:title>
-  <cs:trendline>
-    <cs:lnRef idx="0">
-      <cs:styleClr val="auto"/>
-    </cs:lnRef>
-    <cs:fillRef idx="0"/>
-    <cs:effectRef idx="0"/>
-    <cs:fontRef idx="minor">
-      <a:schemeClr val="tx1"/>
-    </cs:fontRef>
-    <cs:spPr>
-      <a:ln w="19050" cap="rnd">
-        <a:solidFill>
-          <a:schemeClr val="phClr"/>
-        </a:solidFill>
-        <a:prstDash val="sysDot"/>
-      </a:ln>
-    </cs:spPr>
-  </cs:trendline>
-  <cs:trendlineLabel>
-    <cs:lnRef idx="0"/>
-    <cs:fillRef idx="0"/>
-    <cs:effectRef idx="0"/>
-    <cs:fontRef idx="minor">
-      <a:schemeClr val="tx1">
-        <a:lumMod val="65000"/>
-        <a:lumOff val="35000"/>
-      </a:schemeClr>
-    </cs:fontRef>
-    <cs:defRPr sz="900" kern="1200"/>
-  </cs:trendlineLabel>
-  <cs:upBar>
-    <cs:lnRef idx="0"/>
-    <cs:fillRef idx="0"/>
-    <cs:effectRef idx="0"/>
-    <cs:fontRef idx="minor">
-      <a:schemeClr val="dk1"/>
-    </cs:fontRef>
-    <cs:spPr>
-      <a:solidFill>
-        <a:schemeClr val="lt1"/>
-      </a:solidFill>
-      <a:ln w="9525">
-        <a:solidFill>
-          <a:schemeClr val="tx1">
-            <a:lumMod val="15000"/>
-            <a:lumOff val="85000"/>
-          </a:schemeClr>
-        </a:solidFill>
-      </a:ln>
-    </cs:spPr>
-  </cs:upBar>
-  <cs:valueAxis>
-    <cs:lnRef idx="0"/>
-    <cs:fillRef idx="0"/>
-    <cs:effectRef idx="0"/>
-    <cs:fontRef idx="minor">
-      <a:schemeClr val="tx1">
-        <a:lumMod val="65000"/>
-        <a:lumOff val="35000"/>
-      </a:schemeClr>
-    </cs:fontRef>
-    <cs:defRPr sz="900" kern="1200"/>
-  </cs:valueAxis>
-  <cs:wall>
-    <cs:lnRef idx="0"/>
-    <cs:fillRef idx="0"/>
-    <cs:effectRef idx="0"/>
-    <cs:fontRef idx="minor">
-      <a:schemeClr val="tx1"/>
-    </cs:fontRef>
-    <cs:spPr>
-      <a:noFill/>
-      <a:ln>
-        <a:noFill/>
-      </a:ln>
-    </cs:spPr>
-  </cs:wall>
-</cs:chartStyle>
-</file>
-
-<file path=word/charts/style2.xml><?xml version="1.0" encoding="utf-8"?>
-<cs:chartStyle xmlns:cs="http://schemas.microsoft.com/office/drawing/2012/chartStyle" xmlns:a="http://schemas.openxmlformats.org/drawingml/2006/main" id="332">
   <cs:axisTitle>
     <cs:lnRef idx="0"/>
     <cs:fillRef idx="0"/>

</xml_diff>